<commit_message>
Port Douglas and Newstead Rev G: aerial imagery capability
Co-Authored-By: Claude Opus 5.5 <noreply@anthropic.com>
Claude-Session: https://claude.ai/code/session_01RKGFyarCMuMinKYL7AiBap
</commit_message>
<xml_diff>
--- a/FP/VP527224/Final/03. 2026-092 Response Schedule (PART 6)_JCE_FILLED_RevG.docx
+++ b/FP/VP527224/Final/03. 2026-092 Response Schedule (PART 6)_JCE_FILLED_RevG.docx
@@ -4594,7 +4594,7 @@
               <w:rPr>
                 <w:sz w:val="17"/>
               </w:rPr>
-              <w:t>RPEQ (Civil) supervision and sign-off</w:t>
+              <w:t>RPEQ supervision and sign-off of JCE engineering outputs</w:t>
             </w:r>
           </w:p>
         </w:tc>
@@ -4611,7 +4611,7 @@
               <w:rPr>
                 <w:sz w:val="17"/>
               </w:rPr>
-              <w:t>Ben Lancini, Lancini Consulting [TBC - Jayden: confirm]</w:t>
+              <w:t>Sunny Lotay (RPEQ, Lotay Civil)</w:t>
             </w:r>
           </w:p>
         </w:tc>
@@ -4645,7 +4645,7 @@
               <w:rPr>
                 <w:sz w:val="17"/>
               </w:rPr>
-              <w:t>CPEng, NER, RPEQ [TBC - Jayden: RPEQ number and CV]</w:t>
+              <w:t>RPEQ. Signs JCE engineering outputs for this commission. CV attached.</w:t>
             </w:r>
           </w:p>
         </w:tc>
@@ -5080,7 +5080,7 @@
               <w:rPr>
                 <w:sz w:val="17"/>
               </w:rPr>
-              <w:t>RPEQ (Civil) supervision and sign-off of JCE inputs</w:t>
+              <w:t>RPEQ supervision and sign-off of JCE engineering outputs</w:t>
             </w:r>
           </w:p>
         </w:tc>
@@ -5097,7 +5097,7 @@
               <w:rPr>
                 <w:sz w:val="17"/>
               </w:rPr>
-              <w:t>Lancini Consulting [TBC - Jayden: confirm and add address]</w:t>
+              <w:t>Lotay Civil (Sunny Lotay)</w:t>
             </w:r>
           </w:p>
         </w:tc>
@@ -5114,7 +5114,7 @@
               <w:rPr>
                 <w:sz w:val="17"/>
               </w:rPr>
-              <w:t>CPEng, NER, RPEQ</w:t>
+              <w:t>RPEQ</w:t>
             </w:r>
           </w:p>
         </w:tc>

</xml_diff>

<commit_message>
Hawthorn Rd Rev G: Tablelands floodway project and referee
Co-Authored-By: Claude Opus 5.5 <noreply@anthropic.com>
Claude-Session: https://claude.ai/code/session_01RKGFyarCMuMinKYL7AiBap
</commit_message>
<xml_diff>
--- a/FP/VP527224/Final/03. 2026-092 Response Schedule (PART 6)_JCE_FILLED_RevG.docx
+++ b/FP/VP527224/Final/03. 2026-092 Response Schedule (PART 6)_JCE_FILLED_RevG.docx
@@ -3690,7 +3690,7 @@
         <w:rPr>
           <w:i w:val="0"/>
         </w:rPr>
-        <w:t>Douglas Shire has a population of more than 12,000 and a tourism economy of about $574 million with more than 2,500 jobs, built on the Great Barrier Reef and the Daintree. The closure of the Mossman Mill, COVID-19 and Tropical Cyclone Jasper have shown the need to diversify the economy, and the State's Mossman Transition Plan funds this study. Council has already completed the Port Douglas Waterfront South Tourism and Marine Master Plan (2019) and has argued in its submission on the draft FNQ Regional Plan for a south dock industry precinct, while the draft plan maps Dickson Inlet as a regional biodiversity corridor. Jayden Callen was based in Townsville until 05/2026, managed civil design for remote Cape York communities, and has worked on the client side for a Far North Queensland council.</w:t>
+        <w:t>Douglas Shire has a population of more than 12,000 and a tourism economy of about $574 million with more than 2,500 jobs, built on the Great Barrier Reef and the Daintree. The closure of the Mossman Mill, COVID-19 and Tropical Cyclone Jasper have shown the need to diversify the economy, and the State's Mossman Transition Plan funds this study. Council has already completed the Port Douglas Waterfront South Tourism and Marine Master Plan (2019) and has argued in its submission on the draft FNQ Regional Plan for a south dock industry precinct, while the draft plan maps Dickson Inlet as a regional biodiversity corridor. Jayden Callen was based in Townsville until 05/2026, managed civil design for remote Cape York communities, has delivered engineering for Tablelands Regional Council, and has worked on the client side for a Far North Queensland council.</w:t>
       </w:r>
     </w:p>
     <w:p>
@@ -4005,6 +4005,150 @@
                 <w:sz w:val="17"/>
               </w:rPr>
               <w:t>Client Name and Contact Details</w:t>
+            </w:r>
+          </w:p>
+        </w:tc>
+      </w:tr>
+      <w:tr>
+        <w:trPr>
+          <w:cantSplit/>
+        </w:trPr>
+        <w:tc>
+          <w:tcPr>
+            <w:tcW w:type="dxa" w:w="2551"/>
+          </w:tcPr>
+          <w:p>
+            <w:pPr>
+              <w:keepNext/>
+            </w:pPr>
+            <w:r/>
+            <w:r>
+              <w:rPr>
+                <w:sz w:val="17"/>
+              </w:rPr>
+              <w:t>Floodway rectification, Tablelands Regional Council (QLD)</w:t>
+            </w:r>
+          </w:p>
+        </w:tc>
+        <w:tc>
+          <w:tcPr>
+            <w:tcW w:type="dxa" w:w="3402"/>
+          </w:tcPr>
+          <w:p>
+            <w:pPr>
+              <w:keepNext/>
+            </w:pPr>
+            <w:r/>
+            <w:r>
+              <w:rPr>
+                <w:sz w:val="17"/>
+              </w:rPr>
+              <w:t>Engineering for the rectification of a floodway on Council's road network</w:t>
+            </w:r>
+          </w:p>
+        </w:tc>
+        <w:tc>
+          <w:tcPr>
+            <w:tcW w:type="dxa" w:w="1247"/>
+          </w:tcPr>
+          <w:p>
+            <w:pPr>
+              <w:keepNext/>
+            </w:pPr>
+            <w:r/>
+            <w:r>
+              <w:rPr>
+                <w:sz w:val="17"/>
+              </w:rPr>
+            </w:r>
+          </w:p>
+        </w:tc>
+        <w:tc>
+          <w:tcPr>
+            <w:tcW w:type="dxa" w:w="2438"/>
+          </w:tcPr>
+          <w:p>
+            <w:pPr>
+              <w:keepNext/>
+            </w:pPr>
+            <w:r/>
+            <w:r>
+              <w:rPr>
+                <w:sz w:val="17"/>
+              </w:rPr>
+              <w:t>Darren Quilliam, Tablelands Regional Council; contact details available on request</w:t>
+            </w:r>
+          </w:p>
+        </w:tc>
+      </w:tr>
+      <w:tr>
+        <w:trPr>
+          <w:cantSplit/>
+        </w:trPr>
+        <w:tc>
+          <w:tcPr>
+            <w:tcW w:type="dxa" w:w="2551"/>
+          </w:tcPr>
+          <w:p>
+            <w:pPr>
+              <w:keepNext/>
+            </w:pPr>
+            <w:r/>
+            <w:r>
+              <w:rPr>
+                <w:sz w:val="17"/>
+              </w:rPr>
+              <w:t>Leachate storage facility, Tablelands Regional Council (QLD)</w:t>
+            </w:r>
+          </w:p>
+        </w:tc>
+        <w:tc>
+          <w:tcPr>
+            <w:tcW w:type="dxa" w:w="3402"/>
+          </w:tcPr>
+          <w:p>
+            <w:pPr>
+              <w:keepNext/>
+            </w:pPr>
+            <w:r/>
+            <w:r>
+              <w:rPr>
+                <w:sz w:val="17"/>
+              </w:rPr>
+              <w:t>Engineering for a landfill leachate storage facility</w:t>
+            </w:r>
+          </w:p>
+        </w:tc>
+        <w:tc>
+          <w:tcPr>
+            <w:tcW w:type="dxa" w:w="1247"/>
+          </w:tcPr>
+          <w:p>
+            <w:pPr>
+              <w:keepNext/>
+            </w:pPr>
+            <w:r/>
+            <w:r>
+              <w:rPr>
+                <w:sz w:val="17"/>
+              </w:rPr>
+            </w:r>
+          </w:p>
+        </w:tc>
+        <w:tc>
+          <w:tcPr>
+            <w:tcW w:type="dxa" w:w="2438"/>
+          </w:tcPr>
+          <w:p>
+            <w:pPr>
+              <w:keepNext/>
+            </w:pPr>
+            <w:r/>
+            <w:r>
+              <w:rPr>
+                <w:sz w:val="17"/>
+              </w:rPr>
+              <w:t>Darren Quilliam, Tablelands Regional Council; contact details available on request</w:t>
             </w:r>
           </w:p>
         </w:tc>
@@ -4499,7 +4643,7 @@
               <w:rPr>
                 <w:sz w:val="17"/>
               </w:rPr>
-              <w:t>Director, JCE. BEng (Hons), MIEAust (EA 11036201), NER application in progress. Civil Design Manager, Langtree Consulting Engineers, Townsville (2025 to 2026); Senior Engineer and Design Manager, SCP Consulting (2023 to 2025), including HMAS Cairns and RAAF Base Townsville; DATSIP subdivisions in Cape York. CV attached. Jayden has delivered drone photogrammetry on previous projects, planning automated flight paths in DroneDeploy, capturing RTK-positioned photogrammetry and high-resolution aerial stills and video, and processing in Autodesk ReCap Pro to build point clouds and terrain surfaces for use in Autodesk InfraWorks and civil design models. Example: farm drainage works for a private rural client (Craig Sullivan), drone photogrammetry with RTK-positioned automated flights processed in ReCap Pro to a terrain surface for the drainage design; referee details available on request.</w:t>
+              <w:t>Director, JCE. BEng (Hons), MIEAust (EA 11036201), NER application in progress. Civil Design Manager, Langtree Consulting Engineers, Townsville (2025 to 2026); Senior Engineer and Design Manager, SCP Consulting (2023 to 2025), including HMAS Cairns and RAAF Base Townsville; DATSIP subdivisions in Cape York; floodway rectification and a landfill leachate storage facility for Tablelands Regional Council (QLD). CV attached. Jayden has delivered drone photogrammetry on previous projects, planning automated flight paths in DroneDeploy, capturing RTK-positioned photogrammetry and high-resolution aerial stills and video, and processing in Autodesk ReCap Pro to build point clouds and terrain surfaces for use in Autodesk InfraWorks and civil design models. Example: farm drainage works for a private rural client (Craig Sullivan), drone photogrammetry with RTK-positioned automated flights processed in ReCap Pro to a terrain surface for the drainage design; referee details available on request.</w:t>
             </w:r>
           </w:p>
         </w:tc>
@@ -8539,7 +8683,7 @@
         <w:rPr>
           <w:i w:val="0"/>
         </w:rPr>
-        <w:t>JCE Infrastructure is a principal-led civil and hydraulic engineering consultancy based at Gunnedah NSW and working across NSW and Queensland. Jayden Callen was based in Townsville until 05/2026, managing engineering work that included remote Cape York communities and Defence works at HMAS Cairns, and has worked on the client side for a Far North Queensland council. Engineering opinions in the study are signed by RPEQs. JCE also delivers drone photogrammetry, and its related business Glide Inside produces 3D digital models and visualisation (Schedule E3). Value-Add proposals: grant-ready project summary and roadmap; staged costings so early works can be funded separately; master plan in GIS and CAD formats.</w:t>
+        <w:t>JCE Infrastructure is a principal-led civil and hydraulic engineering consultancy based at Gunnedah NSW and working across NSW and Queensland. Jayden Callen was based in Townsville until 05/2026, managing engineering work that included remote Cape York communities and Defence works at HMAS Cairns, has delivered floodway rectification and leachate storage facility engineering for Tablelands Regional Council, and has worked on the client side for a Far North Queensland council. Engineering opinions in the study are signed by RPEQs. JCE also delivers drone photogrammetry, and its related business Glide Inside produces 3D digital models and visualisation (Schedule E3). Value-Add proposals: grant-ready project summary and roadmap; staged costings so early works can be funded separately; master plan in GIS and CAD formats.</w:t>
       </w:r>
     </w:p>
     <w:p>

</xml_diff>